<commit_message>
Refactor AI Critique and Audit Reports; update Git log and templates
- Revised AI Critique in markdown and PDF formats to reflect student-authored content.
- Updated AI Audit Report to include accurate artifact counts and details on AI contributions.
- Enhanced Git commit log with recent submissions and changes.
- Modified AI Disclosure Form and Privacy Checklist to clarify AI usage and contributions.
- Adjusted build scripts to ensure proper word count validation for AI Critique.
- Improved documentation in README to specify AI tool usage and artifact details.
</commit_message>
<xml_diff>
--- a/submission/05_Templates_AI/[AI-03] AI Disclosure Form - 23120231.docx
+++ b/submission/05_Templates_AI/[AI-03] AI Disclosure Form - 23120231.docx
@@ -483,7 +483,7 @@
           <w:i w:val="0"/>
           <w:sz w:val="20"/>
         </w:rPr>
-        <w:t>Mỗi lần dùng AI đều ghi trong audit/AI_AUDIT_LOG.md (26 mục, Appendix A).</w:t>
+        <w:t>Mỗi lần dùng AI đều ghi trong audit/AI_AUDIT_LOG.md (27 mục, Appendix A).</w:t>
       </w:r>
     </w:p>
     <w:p>
@@ -535,7 +535,7 @@
           <w:i w:val="0"/>
           <w:sz w:val="20"/>
         </w:rPr>
-        <w:t>KHÔNG dùng AI cho: [SINH VIÊN ĐIỀN — ví dụ quay video demo có giọng nói, tự chạy lại và kiểm tra kết quả, bảo vệ miệng].</w:t>
+        <w:t>KHÔNG dùng AI cho: nội dung cuối cùng của AI Critique (sinh viên tự viết). [SINH VIÊN ĐIỀN thêm — ví dụ quay video demo có giọng nói, tự chạy lại và kiểm tra kết quả, bảo vệ miệng].</w:t>
       </w:r>
     </w:p>
     <w:p>
@@ -629,7 +629,7 @@
           <w:i w:val="0"/>
           <w:sz w:val="20"/>
         </w:rPr>
-        <w:t>AI sinh: bảng giả thuyết Spec-vs-Code; bảng lớp tương đương và 256 test case Domain Testing/BVA (FR-03: 60, FR-10: 71, FR-16: 62, Mobile FR-08/09: 63); script API chạy test; thủ tục và kết quả test UI; báo cáo thực thi; AI gap analysis; 36 bug report và nội dung issue GitHub; Agent Skill domain-testing-bva; README, báo cáo chính, bản nháp AI Critique.</w:t>
+        <w:t>AI sinh: bảng giả thuyết Spec-vs-Code; bảng lớp tương đương và 256 test case Domain Testing/BVA (FR-03: 60, FR-10: 71, FR-16: 62, Mobile FR-08/09: 63); script API chạy test; thủ tục và kết quả test UI; báo cáo thực thi; AI gap analysis; 36 bug report và nội dung issue GitHub; Agent Skill domain-testing-bva; README, báo cáo chính. Một bản nháp AI Critique do AI soạn ở giai đoạn đầu đã bị loại bỏ và không dùng.</w:t>
       </w:r>
     </w:p>
     <w:p>
@@ -639,7 +639,7 @@
           <w:i w:val="0"/>
           <w:sz w:val="20"/>
         </w:rPr>
-        <w:t>Sinh viên: chọn 4 feature theo bảng phân công nhóm; ra yêu cầu từng bước; quyết định dùng repo cá nhân, đẩy commit và đăng issue lên GitHub. [SINH VIÊN ĐIỀN: các phần tự làm/tự viết lại, ví dụ AI Critique cuối, video demo].</w:t>
+        <w:t>Sinh viên: chọn 4 feature theo bảng phân công nhóm; ra yêu cầu từng bước; quyết định dùng repo cá nhân, đẩy commit và đăng issue lên GitHub. AI Critique cuối cùng do sinh viên tự viết hoàn toàn. [SINH VIÊN ĐIỀN: các phần khác tự làm/tự viết lại, ví dụ video demo].</w:t>
       </w:r>
     </w:p>
     <w:p>

</xml_diff>